<commit_message>
Inicialización del código en visual estudio
</commit_message>
<xml_diff>
--- a/Idea de juego.docx
+++ b/Idea de juego.docx
@@ -25,8 +25,33 @@
         <w:rPr>
           <w:lang w:val="es-ES"/>
         </w:rPr>
-        <w:t>Si adivas el resultado de la multiplicación, te ganas un premio</w:t>
+        <w:t>Si adiv</w:t>
       </w:r>
+      <w:r>
+        <w:rPr>
+          <w:lang w:val="es-ES"/>
+        </w:rPr>
+        <w:t>in</w:t>
+      </w:r>
+      <w:r>
+        <w:rPr>
+          <w:lang w:val="es-ES"/>
+        </w:rPr>
+        <w:t>as el resultado de la multiplicación, te ganas un premio</w:t>
+      </w:r>
+      <w:r>
+        <w:rPr>
+          <w:lang w:val="es-ES"/>
+        </w:rPr>
+        <w:t>.</w:t>
+      </w:r>
+    </w:p>
+    <w:p>
+      <w:pPr>
+        <w:rPr>
+          <w:lang w:val="es-ES"/>
+        </w:rPr>
+      </w:pPr>
     </w:p>
     <w:p>
       <w:pPr>

</xml_diff>